<commit_message>
Revised report: improve wording, grammar, and clarity
</commit_message>
<xml_diff>
--- a/Project report.docx
+++ b/Project report.docx
@@ -183,7 +183,7 @@
                   <w:sz w:val="28"/>
                   <w:szCs w:val="28"/>
                 </w:rPr>
-                <w:t>GITHUB:  link</w:t>
+                <w:t>GITHUB:  https://github.com/Ouambo-SIM/Sales-Prediction-with-ML-and-M5-data.git</w:t>
               </w:r>
             </w:p>
           </w:sdtContent>
@@ -584,18 +584,10 @@
     </w:sdt>
     <w:p>
       <w:pPr>
-        <w:rPr>
-          <w:b/>
-          <w:bCs/>
-        </w:rPr>
+        <w:pStyle w:val="Heading1"/>
       </w:pPr>
-    </w:p>
-    <w:p>
-      <w:r>
-        <w:rPr>
-          <w:b/>
-          <w:bCs/>
-        </w:rPr>
+      <w:r>
+        <w:lastRenderedPageBreak/>
         <w:t xml:space="preserve">Introduction </w:t>
       </w:r>
     </w:p>
@@ -621,59 +613,64 @@
         <w:t>ies</w:t>
       </w:r>
       <w:r>
-        <w:t>. However, developing such strategies can necessitate years of product and sales experience</w:t>
-      </w:r>
-      <w:r>
-        <w:t xml:space="preserve"> which is difficult to</w:t>
+        <w:t xml:space="preserve">. </w:t>
+      </w:r>
+      <w:r>
+        <w:t>However, developing such strategies can necessitate years of product and sales experience, which is difficult to acquire</w:t>
+      </w:r>
+      <w:r>
+        <w:t xml:space="preserve">. </w:t>
+      </w:r>
+      <w:r>
+        <w:t>Moreover, most products exhibit highly volatile sales figures, and in such cases, even years of experience may not be sufficient.</w:t>
+      </w:r>
+    </w:p>
+    <w:p>
+      <w:r>
+        <w:t>Machine learning models can help democratize advanced supply chain optimization methods</w:t>
+      </w:r>
+      <w:r>
+        <w:t xml:space="preserve">, as they </w:t>
+      </w:r>
+      <w:r>
+        <w:t>can identify</w:t>
+      </w:r>
+      <w:r>
+        <w:t xml:space="preserve"> intricate patterns invisible to the human eye, even in a </w:t>
+      </w:r>
+      <w:r>
+        <w:t>complicated</w:t>
+      </w:r>
+      <w:r>
+        <w:t xml:space="preserve"> case like sales prediction.</w:t>
+      </w:r>
+    </w:p>
+    <w:p>
+      <w:r>
+        <w:t>The dataset used for this project consists of Walmart sales data previously provided for the M5 competition</w:t>
+      </w:r>
+      <w:r>
+        <w:t xml:space="preserve">, </w:t>
+      </w:r>
+      <w:r>
+        <w:t xml:space="preserve">where numerous researchers tested a wide range </w:t>
+      </w:r>
+      <w:proofErr w:type="gramStart"/>
+      <w:r>
+        <w:t>of</w:t>
       </w:r>
       <w:r>
         <w:t xml:space="preserve"> </w:t>
       </w:r>
       <w:r>
-        <w:t>achieve</w:t>
-      </w:r>
-      <w:r>
-        <w:t>. Also, most product</w:t>
-      </w:r>
-      <w:r>
-        <w:t>s have</w:t>
-      </w:r>
-      <w:r>
-        <w:t xml:space="preserve"> very volatile </w:t>
-      </w:r>
-      <w:r>
-        <w:t xml:space="preserve">sales figures and, </w:t>
-      </w:r>
-      <w:r>
-        <w:t>in such</w:t>
-      </w:r>
-      <w:r>
-        <w:t xml:space="preserve"> cases,</w:t>
-      </w:r>
-      <w:r>
-        <w:t xml:space="preserve"> even years of experience might not be enough. </w:t>
-      </w:r>
-    </w:p>
-    <w:p>
-      <w:r>
-        <w:t xml:space="preserve">Machine Learning models might be able to democratize the best supply chain optimization methods, as they </w:t>
-      </w:r>
-      <w:r>
-        <w:t>can identify</w:t>
-      </w:r>
-      <w:r>
-        <w:t xml:space="preserve"> intricate patterns invisible to the human eye, even in a </w:t>
-      </w:r>
-      <w:r>
-        <w:t>complicated</w:t>
-      </w:r>
-      <w:r>
-        <w:t xml:space="preserve"> case like sales prediction.</w:t>
-      </w:r>
-    </w:p>
-    <w:p>
-      <w:r>
-        <w:t xml:space="preserve">The data set used for this project is Walmart sales data previously provided for an M5 competition, where numerous scientists tested several statistical methods to predict sales at specific dates in the future. </w:t>
+        <w:t xml:space="preserve"> methods</w:t>
+      </w:r>
+      <w:proofErr w:type="gramEnd"/>
+      <w:r>
+        <w:t xml:space="preserve"> </w:t>
+      </w:r>
+      <w:r>
+        <w:t xml:space="preserve">to predict sales at specific dates in the future. </w:t>
       </w:r>
     </w:p>
     <w:p>
@@ -702,41 +699,27 @@
         <w:t xml:space="preserve">, with the goal of predicting its </w:t>
       </w:r>
       <w:r>
-        <w:t>future sales on specific days using prior sales data.</w:t>
-      </w:r>
-    </w:p>
-    <w:p>
-      <w:r>
-        <w:t xml:space="preserve">The dataset </w:t>
-      </w:r>
-      <w:r>
-        <w:t xml:space="preserve">comprises </w:t>
-      </w:r>
-      <w:r>
-        <w:t xml:space="preserve">Walmart sales data from </w:t>
-      </w:r>
-      <w:r>
-        <w:t xml:space="preserve"> 01/29/2011 to 06/19/2016</w:t>
-      </w:r>
-      <w:r>
-        <w:t xml:space="preserve">(~5.4 years) </w:t>
-      </w:r>
-      <w:r>
-        <w:t xml:space="preserve">for one </w:t>
-      </w:r>
-      <w:r>
-        <w:t>product. The</w:t>
+        <w:t>future sales using prior sales data.</w:t>
+      </w:r>
+    </w:p>
+    <w:p>
+      <w:r>
+        <w:t>The dataset comprises Walmart sales data from January 29, 2011, to June 19, 2016 (approximately 5.4 years).</w:t>
+      </w:r>
+      <w:r>
+        <w:t xml:space="preserve"> </w:t>
+      </w:r>
+      <w:r>
+        <w:t>The</w:t>
       </w:r>
       <w:r>
         <w:t xml:space="preserve"> table below describes the dataset’s content</w:t>
       </w:r>
+      <w:r>
+        <w:t>.</w:t>
+      </w:r>
     </w:p>
     <w:p/>
-    <w:p>
-      <w:r>
-        <w:t xml:space="preserve">Table1: </w:t>
-      </w:r>
-    </w:p>
     <w:tbl>
       <w:tblPr>
         <w:tblStyle w:val="TableGrid"/>
@@ -797,8 +780,11 @@
             <w:tcW w:w="4675" w:type="dxa"/>
           </w:tcPr>
           <w:p>
-            <w:r>
-              <w:t xml:space="preserve">Temporal data </w:t>
+            <w:pPr>
+              <w:jc w:val="center"/>
+            </w:pPr>
+            <w:r>
+              <w:t>Temporal data</w:t>
             </w:r>
           </w:p>
         </w:tc>
@@ -822,8 +808,11 @@
             <w:tcW w:w="4675" w:type="dxa"/>
           </w:tcPr>
           <w:p>
-            <w:r>
-              <w:t xml:space="preserve">Event data </w:t>
+            <w:pPr>
+              <w:jc w:val="center"/>
+            </w:pPr>
+            <w:r>
+              <w:t>Event data</w:t>
             </w:r>
           </w:p>
         </w:tc>
@@ -844,8 +833,11 @@
             <w:tcW w:w="4675" w:type="dxa"/>
           </w:tcPr>
           <w:p>
-            <w:r>
-              <w:t xml:space="preserve">Pricing data </w:t>
+            <w:pPr>
+              <w:jc w:val="center"/>
+            </w:pPr>
+            <w:r>
+              <w:t>Pricing data</w:t>
             </w:r>
           </w:p>
         </w:tc>
@@ -866,6 +858,9 @@
             <w:tcW w:w="4675" w:type="dxa"/>
           </w:tcPr>
           <w:p>
+            <w:pPr>
+              <w:jc w:val="center"/>
+            </w:pPr>
             <w:r>
               <w:t>Sales data</w:t>
             </w:r>
@@ -888,6 +883,9 @@
             <w:tcW w:w="4675" w:type="dxa"/>
           </w:tcPr>
           <w:p>
+            <w:pPr>
+              <w:jc w:val="center"/>
+            </w:pPr>
             <w:r>
               <w:t>Other</w:t>
             </w:r>
@@ -922,7 +920,7 @@
               <w:t xml:space="preserve"> </w:t>
             </w:r>
             <w:r>
-              <w:t>allowed</w:t>
+              <w:t>eligibility</w:t>
             </w:r>
             <w:r>
               <w:t xml:space="preserve"> </w:t>
@@ -946,7 +944,19 @@
         <w:t xml:space="preserve">Previous attempts at predicting </w:t>
       </w:r>
       <w:r>
-        <w:t xml:space="preserve">future sales on this data can be examined from the </w:t>
+        <w:t>future sales on this data</w:t>
+      </w:r>
+      <w:r>
+        <w:t>set</w:t>
+      </w:r>
+      <w:r>
+        <w:t xml:space="preserve"> can be examined </w:t>
+      </w:r>
+      <w:r>
+        <w:t>in</w:t>
+      </w:r>
+      <w:r>
+        <w:t xml:space="preserve"> the </w:t>
       </w:r>
       <w:r>
         <w:t xml:space="preserve">M5 competition GitHub Repository </w:t>
@@ -989,29 +999,62 @@
     </w:p>
     <w:p>
       <w:r>
+        <w:t>-Global Random Forest</w:t>
+      </w:r>
+    </w:p>
+    <w:p>
+      <w:r>
         <w:lastRenderedPageBreak/>
-        <w:t>-Global Random Forest</w:t>
-      </w:r>
-    </w:p>
-    <w:p>
-      <w:r>
-        <w:t xml:space="preserve">Among the competition’s goals, the one most similar to </w:t>
+        <w:t xml:space="preserve">Among the competition’s goals, the one most </w:t>
+      </w:r>
+      <w:proofErr w:type="gramStart"/>
+      <w:r>
+        <w:t>similar to</w:t>
+      </w:r>
+      <w:proofErr w:type="gramEnd"/>
+      <w:r>
+        <w:t xml:space="preserve"> </w:t>
       </w:r>
       <w:r>
         <w:t>mine</w:t>
       </w:r>
       <w:r>
-        <w:t xml:space="preserve"> was</w:t>
-      </w:r>
-      <w:r>
-        <w:t xml:space="preserve"> 28 days</w:t>
-      </w:r>
-      <w:r>
-        <w:t xml:space="preserve"> ahead point forecas</w:t>
+        <w:t xml:space="preserve"> </w:t>
+      </w:r>
+      <w:proofErr w:type="gramStart"/>
+      <w:r>
+        <w:t>was</w:t>
+      </w:r>
+      <w:r>
+        <w:t xml:space="preserve"> </w:t>
+      </w:r>
+      <w:r>
+        <w:t xml:space="preserve"> </w:t>
+      </w:r>
+      <w:r>
+        <w:t>28</w:t>
+      </w:r>
+      <w:proofErr w:type="gramEnd"/>
+      <w:r>
+        <w:t>-</w:t>
+      </w:r>
+      <w:r>
+        <w:t>day</w:t>
+      </w:r>
+      <w:r>
+        <w:t>-</w:t>
+      </w:r>
+      <w:r>
+        <w:t xml:space="preserve">ahead point </w:t>
+      </w:r>
+      <w:proofErr w:type="gramStart"/>
+      <w:r>
+        <w:t>forecas</w:t>
       </w:r>
       <w:r>
         <w:t>ting</w:t>
       </w:r>
+      <w:proofErr w:type="gramEnd"/>
       <w:r>
         <w:t xml:space="preserve">. </w:t>
       </w:r>
@@ -1030,7 +1073,15 @@
         <w:t xml:space="preserve"> </w:t>
       </w:r>
       <w:r>
-        <w:t>the competition used Weighted Root  Mean Squared Scale</w:t>
+        <w:t xml:space="preserve">the competition used Weighted </w:t>
+      </w:r>
+      <w:proofErr w:type="gramStart"/>
+      <w:r>
+        <w:t>Root  Mean</w:t>
+      </w:r>
+      <w:proofErr w:type="gramEnd"/>
+      <w:r>
+        <w:t xml:space="preserve"> Squared Scale</w:t>
       </w:r>
       <w:r>
         <w:t xml:space="preserve">d </w:t>
@@ -1039,10 +1090,27 @@
         <w:t>error</w:t>
       </w:r>
       <w:r>
-        <w:t xml:space="preserve">(WRMSSE) </w:t>
-      </w:r>
-      <w:r>
-        <w:t xml:space="preserve"> as metric and </w:t>
+        <w:t xml:space="preserve"> </w:t>
+      </w:r>
+      <w:r>
+        <w:t>(</w:t>
+      </w:r>
+      <w:proofErr w:type="gramStart"/>
+      <w:r>
+        <w:t xml:space="preserve">WRMSSE) </w:t>
+      </w:r>
+      <w:r>
+        <w:t xml:space="preserve"> as</w:t>
+      </w:r>
+      <w:proofErr w:type="gramEnd"/>
+      <w:r>
+        <w:t xml:space="preserve"> </w:t>
+      </w:r>
+      <w:r>
+        <w:t xml:space="preserve">evaluation </w:t>
+      </w:r>
+      <w:r>
+        <w:t xml:space="preserve">metric and </w:t>
       </w:r>
       <w:r>
         <w:t xml:space="preserve">the </w:t>
@@ -1067,11 +1135,10 @@
       </w:r>
     </w:p>
     <w:p>
-      <w:r>
-        <w:rPr>
-          <w:b/>
-          <w:bCs/>
-        </w:rPr>
+      <w:pPr>
+        <w:pStyle w:val="Heading1"/>
+      </w:pPr>
+      <w:r>
         <w:t xml:space="preserve">EDA </w:t>
       </w:r>
     </w:p>
@@ -1083,10 +1150,19 @@
         <w:t xml:space="preserve">wing EDA </w:t>
       </w:r>
       <w:r>
-        <w:t xml:space="preserve">shows some of the most interesting, unexpected and important </w:t>
-      </w:r>
-      <w:r>
-        <w:t>insights I found from Exploratory Data Analysis on the dataset.</w:t>
+        <w:t>shows some of the most interesting, unexpected</w:t>
+      </w:r>
+      <w:r>
+        <w:t>,</w:t>
+      </w:r>
+      <w:r>
+        <w:t xml:space="preserve"> and important </w:t>
+      </w:r>
+      <w:r>
+        <w:t>insights</w:t>
+      </w:r>
+      <w:r>
+        <w:t>.</w:t>
       </w:r>
     </w:p>
     <w:p>
@@ -1141,7 +1217,6 @@
           <w:szCs w:val="18"/>
         </w:rPr>
       </w:pPr>
-      <w:proofErr w:type="spellStart"/>
       <w:r>
         <w:rPr>
           <w:i/>
@@ -1149,9 +1224,8 @@
           <w:sz w:val="18"/>
           <w:szCs w:val="18"/>
         </w:rPr>
-        <w:t>Figure:Total</w:t>
-      </w:r>
-      <w:proofErr w:type="spellEnd"/>
+        <w:t>Figure:</w:t>
+      </w:r>
       <w:r>
         <w:rPr>
           <w:i/>
@@ -1168,6 +1242,15 @@
           <w:sz w:val="18"/>
           <w:szCs w:val="18"/>
         </w:rPr>
+        <w:t xml:space="preserve">Total </w:t>
+      </w:r>
+      <w:r>
+        <w:rPr>
+          <w:i/>
+          <w:iCs/>
+          <w:sz w:val="18"/>
+          <w:szCs w:val="18"/>
+        </w:rPr>
         <w:t>sales over the years from 2011 to 2016</w:t>
       </w:r>
     </w:p>
@@ -1188,19 +1271,35 @@
         <w:t xml:space="preserve"> been decreasing</w:t>
       </w:r>
       <w:r>
-        <w:t xml:space="preserve"> from 2011 to 2</w:t>
+        <w:t xml:space="preserve"> from 2011 to </w:t>
+      </w:r>
+      <w:proofErr w:type="gramStart"/>
+      <w:r>
+        <w:t>2</w:t>
       </w:r>
       <w:r>
         <w:t xml:space="preserve">012, </w:t>
       </w:r>
       <w:r>
-        <w:t xml:space="preserve">and </w:t>
+        <w:t>and</w:t>
+      </w:r>
+      <w:proofErr w:type="gramEnd"/>
+      <w:r>
+        <w:t xml:space="preserve"> </w:t>
       </w:r>
       <w:r>
         <w:t>stayed about the same from 2012 to 2015</w:t>
       </w:r>
       <w:r>
-        <w:t xml:space="preserve"> after which it dropped</w:t>
+        <w:t xml:space="preserve"> after which </w:t>
+      </w:r>
+      <w:proofErr w:type="gramStart"/>
+      <w:r>
+        <w:t>it</w:t>
+      </w:r>
+      <w:proofErr w:type="gramEnd"/>
+      <w:r>
+        <w:t xml:space="preserve"> dropped</w:t>
       </w:r>
       <w:r>
         <w:t xml:space="preserve">. This is very important because it indicates that using </w:t>
@@ -1218,7 +1317,22 @@
         <w:t>Also, since this is a time series problem,</w:t>
       </w:r>
       <w:r>
-        <w:t xml:space="preserve"> and temporal order of data points matter, there might not be enough </w:t>
+        <w:t xml:space="preserve"> </w:t>
+      </w:r>
+      <w:r>
+        <w:t xml:space="preserve">the </w:t>
+      </w:r>
+      <w:r>
+        <w:t>temporal order of data points matter</w:t>
+      </w:r>
+      <w:r>
+        <w:t xml:space="preserve">s. </w:t>
+      </w:r>
+      <w:r>
+        <w:t>Hence, t</w:t>
+      </w:r>
+      <w:r>
+        <w:t xml:space="preserve">here might not be enough </w:t>
       </w:r>
       <w:r>
         <w:t xml:space="preserve">2016 </w:t>
@@ -1231,6 +1345,9 @@
       </w:r>
     </w:p>
     <w:p>
+      <w:pPr>
+        <w:jc w:val="center"/>
+      </w:pPr>
       <w:r>
         <w:rPr>
           <w:noProof/>
@@ -1295,7 +1412,19 @@
     </w:p>
     <w:p>
       <w:r>
-        <w:t xml:space="preserve">This is an interesting graph, indicating that after experiencing high sales in 2011, Walmart increased the specific product’s prices </w:t>
+        <w:t>This is an interesting graph</w:t>
+      </w:r>
+      <w:r>
+        <w:t xml:space="preserve"> when couples with the previous one. It </w:t>
+      </w:r>
+      <w:r>
+        <w:t>indicat</w:t>
+      </w:r>
+      <w:r>
+        <w:t xml:space="preserve">es </w:t>
+      </w:r>
+      <w:r>
+        <w:t xml:space="preserve">that after experiencing high sales in 2011, Walmart increased the specific product’s prices </w:t>
       </w:r>
       <w:r>
         <w:t xml:space="preserve">to make more </w:t>
@@ -1325,7 +1454,10 @@
         <w:t xml:space="preserve"> </w:t>
       </w:r>
       <w:r>
-        <w:t xml:space="preserve">in an effort to increase sales </w:t>
+        <w:t>to</w:t>
+      </w:r>
+      <w:r>
+        <w:t xml:space="preserve"> increase sales </w:t>
       </w:r>
       <w:r>
         <w:t xml:space="preserve">and </w:t>
@@ -1337,33 +1469,42 @@
         <w:t xml:space="preserve">somewhere below </w:t>
       </w:r>
       <w:r>
-        <w:t xml:space="preserve">an average price of $4 </w:t>
-      </w:r>
-      <w:r>
-        <w:t xml:space="preserve">which was </w:t>
+        <w:t>an average price of $</w:t>
+      </w:r>
+      <w:proofErr w:type="gramStart"/>
+      <w:r>
+        <w:t xml:space="preserve">4 </w:t>
+      </w:r>
+      <w:r>
+        <w:t>which</w:t>
+      </w:r>
+      <w:proofErr w:type="gramEnd"/>
+      <w:r>
+        <w:t xml:space="preserve"> was </w:t>
       </w:r>
       <w:r>
         <w:t xml:space="preserve">probably </w:t>
       </w:r>
-      <w:proofErr w:type="spellStart"/>
-      <w:r>
-        <w:t>walmart’s</w:t>
-      </w:r>
-      <w:proofErr w:type="spellEnd"/>
-      <w:r>
-        <w:t xml:space="preserve"> price limit.</w:t>
-      </w:r>
-    </w:p>
-    <w:p>
+      <w:r>
+        <w:t>W</w:t>
+      </w:r>
+      <w:r>
+        <w:t>almart’s price limit.</w:t>
+      </w:r>
+    </w:p>
+    <w:p>
+      <w:pPr>
+        <w:jc w:val="center"/>
+      </w:pPr>
       <w:r>
         <w:rPr>
           <w:noProof/>
         </w:rPr>
         <w:lastRenderedPageBreak/>
         <w:drawing>
-          <wp:inline distT="0" distB="0" distL="0" distR="0" wp14:anchorId="34A97FBB" wp14:editId="4DD676F8">
-            <wp:extent cx="5943600" cy="4909820"/>
-            <wp:effectExtent l="0" t="0" r="0" b="5080"/>
+          <wp:inline distT="0" distB="0" distL="0" distR="0" wp14:anchorId="34A97FBB" wp14:editId="67C90134">
+            <wp:extent cx="5749159" cy="4749198"/>
+            <wp:effectExtent l="0" t="0" r="4445" b="0"/>
             <wp:docPr id="1837128044" name="Picture 1" descr="A graph of sales&#10;&#10;AI-generated content may be incorrect."/>
             <wp:cNvGraphicFramePr>
               <a:graphicFrameLocks xmlns:a="http://schemas.openxmlformats.org/drawingml/2006/main" noChangeAspect="1"/>
@@ -1384,7 +1525,7 @@
                   <pic:spPr>
                     <a:xfrm>
                       <a:off x="0" y="0"/>
-                      <a:ext cx="5943600" cy="4909820"/>
+                      <a:ext cx="5765717" cy="4762876"/>
                     </a:xfrm>
                     <a:prstGeom prst="rect">
                       <a:avLst/>
@@ -1412,13 +1553,14 @@
         <w:t xml:space="preserve">for each event type </w:t>
       </w:r>
       <w:r>
-        <w:t xml:space="preserve">at various </w:t>
-      </w:r>
-      <w:proofErr w:type="spellStart"/>
-      <w:r>
-        <w:t>Quatities</w:t>
-      </w:r>
-      <w:proofErr w:type="spellEnd"/>
+        <w:t>at various Qua</w:t>
+      </w:r>
+      <w:r>
+        <w:t>n</w:t>
+      </w:r>
+      <w:r>
+        <w:t>tities</w:t>
+      </w:r>
     </w:p>
     <w:p>
       <w:pPr>
@@ -1446,7 +1588,7 @@
           <w:sz w:val="18"/>
           <w:szCs w:val="18"/>
         </w:rPr>
-        <w:t xml:space="preserve">There is another field called EventType2 , signifying the second event </w:t>
+        <w:t xml:space="preserve">There is another field called EventType2, signifying the second event </w:t>
       </w:r>
       <w:r>
         <w:rPr>
@@ -1553,13 +1695,30 @@
         <w:jc w:val="center"/>
       </w:pPr>
       <w:r>
-        <w:t xml:space="preserve">Figure: Autocorrelation plot of Sales Quantity demonstrating </w:t>
+        <w:t xml:space="preserve">Figure: Autocorrelation plot of Sales </w:t>
+      </w:r>
+      <w:r>
+        <w:t>q</w:t>
+      </w:r>
+      <w:r>
+        <w:t xml:space="preserve">uantity demonstrating </w:t>
       </w:r>
       <w:r>
         <w:t xml:space="preserve">correlation between </w:t>
       </w:r>
       <w:r>
-        <w:t xml:space="preserve">data points sales and past sales as </w:t>
+        <w:t xml:space="preserve">current </w:t>
+      </w:r>
+      <w:proofErr w:type="gramStart"/>
+      <w:r>
+        <w:t xml:space="preserve">sales </w:t>
+      </w:r>
+      <w:r>
+        <w:t xml:space="preserve"> and</w:t>
+      </w:r>
+      <w:proofErr w:type="gramEnd"/>
+      <w:r>
+        <w:t xml:space="preserve"> past sales as </w:t>
       </w:r>
       <w:r>
         <w:t>Lags increase.</w:t>
@@ -1579,10 +1738,21 @@
         <w:t xml:space="preserve"> gets into the noise region around 180 lags. </w:t>
       </w:r>
       <w:r>
-        <w:t>Low Model test scores</w:t>
-      </w:r>
-      <w:r>
-        <w:t>(error)</w:t>
+        <w:t xml:space="preserve">Low Model test </w:t>
+      </w:r>
+      <w:proofErr w:type="gramStart"/>
+      <w:r>
+        <w:t>scores</w:t>
+      </w:r>
+      <w:r>
+        <w:t>(</w:t>
+      </w:r>
+      <w:proofErr w:type="gramEnd"/>
+      <w:r>
+        <w:t>RMSE</w:t>
+      </w:r>
+      <w:r>
+        <w:t>)</w:t>
       </w:r>
       <w:r>
         <w:t xml:space="preserve"> </w:t>
@@ -1594,21 +1764,27 @@
         <w:t>lags will</w:t>
       </w:r>
       <w:r>
-        <w:t xml:space="preserve"> be strongly indicative of bugs in my code or data leakage.</w:t>
+        <w:t xml:space="preserve"> be strongly indicative of bugs in my code or</w:t>
+      </w:r>
+      <w:r>
+        <w:t xml:space="preserve">, </w:t>
+      </w:r>
+      <w:r>
+        <w:t xml:space="preserve">even </w:t>
+      </w:r>
+      <w:r>
+        <w:t>data leakage.</w:t>
       </w:r>
     </w:p>
     <w:p/>
-    <w:p/>
-    <w:p>
-      <w:r>
-        <w:rPr>
-          <w:b/>
-          <w:bCs/>
-        </w:rPr>
+    <w:p>
+      <w:pPr>
+        <w:pStyle w:val="Heading1"/>
+      </w:pPr>
+      <w:r>
         <w:t xml:space="preserve">Methods </w:t>
       </w:r>
     </w:p>
-    <w:p/>
     <w:p>
       <w:r>
         <w:t xml:space="preserve">Before any processing, </w:t>
@@ -1634,7 +1810,19 @@
         <w:t>Then</w:t>
       </w:r>
       <w:r>
-        <w:t>, the Dataset is modified to include vector autoregression features</w:t>
+        <w:t xml:space="preserve">, the </w:t>
+      </w:r>
+      <w:r>
+        <w:t>d</w:t>
+      </w:r>
+      <w:r>
+        <w:t xml:space="preserve">ataset </w:t>
+      </w:r>
+      <w:r>
+        <w:t>was</w:t>
+      </w:r>
+      <w:r>
+        <w:t xml:space="preserve"> modified to include vector autoregression features</w:t>
       </w:r>
       <w:r>
         <w:t xml:space="preserve">. </w:t>
@@ -1652,16 +1840,25 @@
         <w:t>e</w:t>
       </w:r>
       <w:r>
-        <w:t>gression features are added to reflect</w:t>
-      </w:r>
-      <w:r>
-        <w:t>, Snap,</w:t>
+        <w:t xml:space="preserve">gression features </w:t>
+      </w:r>
+      <w:r>
+        <w:t>were</w:t>
+      </w:r>
+      <w:r>
+        <w:t xml:space="preserve"> added to reflect</w:t>
       </w:r>
       <w:r>
         <w:t xml:space="preserve"> </w:t>
       </w:r>
       <w:r>
-        <w:t>events, prices , temporal elements(month, day, year) and sales on days prior to th</w:t>
+        <w:t>SNAP eligibility, events, prices, temporal elements</w:t>
+      </w:r>
+      <w:r>
+        <w:t xml:space="preserve"> </w:t>
+      </w:r>
+      <w:r>
+        <w:t>(month, day, year) and sales on days prior to th</w:t>
       </w:r>
       <w:r>
         <w:t xml:space="preserve">at of the prediction. </w:t>
@@ -1670,7 +1867,13 @@
         <w:t xml:space="preserve">Also, </w:t>
       </w:r>
       <w:r>
-        <w:t xml:space="preserve">each data point’s initial features are preserved, </w:t>
+        <w:t xml:space="preserve">each data point’s initial features </w:t>
+      </w:r>
+      <w:r>
+        <w:t>were</w:t>
+      </w:r>
+      <w:r>
+        <w:t xml:space="preserve"> preserved, </w:t>
       </w:r>
       <w:r>
         <w:t>except for</w:t>
@@ -1685,7 +1888,13 @@
         <w:t xml:space="preserve">to prevent data leakage. </w:t>
       </w:r>
       <w:r>
-        <w:t>For prediction, this allows the mo</w:t>
+        <w:t>For prediction, this allow</w:t>
+      </w:r>
+      <w:r>
+        <w:t>ed</w:t>
+      </w:r>
+      <w:r>
+        <w:t xml:space="preserve"> the mo</w:t>
       </w:r>
       <w:r>
         <w:t>del</w:t>
@@ -1699,9 +1908,11 @@
       <w:r>
         <w:t xml:space="preserve"> between </w:t>
       </w:r>
+      <w:proofErr w:type="gramStart"/>
       <w:r>
         <w:t>events ,</w:t>
       </w:r>
+      <w:proofErr w:type="gramEnd"/>
       <w:r>
         <w:t xml:space="preserve"> Snap,</w:t>
       </w:r>
@@ -1715,16 +1926,18 @@
         <w:t>position in time and sales quantity.</w:t>
       </w:r>
       <w:r>
-        <w:t xml:space="preserve"> Number of Lags is a critical hyperparameter </w:t>
-      </w:r>
-      <w:r>
-        <w:t>independently</w:t>
-      </w:r>
-      <w:r>
-        <w:t xml:space="preserve"> tuned in my </w:t>
-      </w:r>
-      <w:r>
-        <w:t>processing</w:t>
+        <w:t xml:space="preserve"> </w:t>
+      </w:r>
+    </w:p>
+    <w:p>
+      <w:r>
+        <w:t>The N</w:t>
+      </w:r>
+      <w:r>
+        <w:t>umber of Lags is a critical hyperparameter tuned</w:t>
+      </w:r>
+      <w:r>
+        <w:t xml:space="preserve"> separately</w:t>
       </w:r>
       <w:r>
         <w:t xml:space="preserve">. </w:t>
@@ -1742,37 +1955,55 @@
         <w:t>the cost function.</w:t>
       </w:r>
       <w:r>
-        <w:t xml:space="preserve"> Early stopping is implemented here </w:t>
-      </w:r>
-      <w:r>
-        <w:t xml:space="preserve">to </w:t>
-      </w:r>
-      <w:r>
-        <w:t>lagging</w:t>
-      </w:r>
-      <w:r>
-        <w:t xml:space="preserve"> when the </w:t>
-      </w:r>
-      <w:r>
-        <w:t xml:space="preserve">cost continuously increase </w:t>
-      </w:r>
-      <w:r>
-        <w:t>across lags</w:t>
-      </w:r>
-      <w:r>
-        <w:t xml:space="preserve"> or </w:t>
-      </w:r>
-      <w:r>
-        <w:t xml:space="preserve">stops reducing </w:t>
-      </w:r>
-      <w:r>
-        <w:t>significantly(improvement</w:t>
-      </w:r>
-      <w:r>
-        <w:t xml:space="preserve"> is less than 0.</w:t>
-      </w:r>
-      <w:r>
-        <w:t xml:space="preserve">2% of the current cost). </w:t>
+        <w:t xml:space="preserve"> Early stopping </w:t>
+      </w:r>
+      <w:r>
+        <w:t>was</w:t>
+      </w:r>
+      <w:r>
+        <w:t xml:space="preserve"> implemented here </w:t>
+      </w:r>
+      <w:r>
+        <w:t xml:space="preserve">to stop lagging when </w:t>
+      </w:r>
+      <w:r>
+        <w:t>the model</w:t>
+      </w:r>
+      <w:r>
+        <w:t xml:space="preserve"> continuously </w:t>
+      </w:r>
+      <w:r>
+        <w:t>performs worse or</w:t>
+      </w:r>
+      <w:r>
+        <w:t xml:space="preserve"> </w:t>
+      </w:r>
+      <w:r>
+        <w:t xml:space="preserve">does not significantly improve as lags increase </w:t>
+      </w:r>
+      <w:r>
+        <w:t>a certain number of times</w:t>
+      </w:r>
+      <w:r>
+        <w:t xml:space="preserve"> </w:t>
+      </w:r>
+      <w:r>
+        <w:t>(</w:t>
+      </w:r>
+      <w:r>
+        <w:t>threshold= &lt;</w:t>
+      </w:r>
+      <w:r>
+        <w:t>0.</w:t>
+      </w:r>
+      <w:r>
+        <w:t xml:space="preserve">2% </w:t>
+      </w:r>
+      <w:r>
+        <w:t>improvement)</w:t>
+      </w:r>
+      <w:r>
+        <w:t xml:space="preserve">. </w:t>
       </w:r>
       <w:r>
         <w:t xml:space="preserve">Within each iteration of </w:t>
@@ -1903,6 +2134,7 @@
         <w:t xml:space="preserve">and </w:t>
       </w:r>
       <w:proofErr w:type="spellStart"/>
+      <w:proofErr w:type="gramStart"/>
       <w:r>
         <w:t>Time</w:t>
       </w:r>
@@ -1911,7 +2143,11 @@
       </w:r>
       <w:proofErr w:type="spellEnd"/>
       <w:r>
-        <w:t xml:space="preserve">( in that order) as splitting strategy. </w:t>
+        <w:t>( in</w:t>
+      </w:r>
+      <w:proofErr w:type="gramEnd"/>
+      <w:r>
+        <w:t xml:space="preserve"> that order) as splitting strategy. </w:t>
       </w:r>
       <w:proofErr w:type="spellStart"/>
       <w:r>
@@ -1925,8 +2161,13 @@
         <w:t xml:space="preserve">s the last </w:t>
       </w:r>
       <w:r>
-        <w:t>20% of my data set(</w:t>
-      </w:r>
+        <w:t xml:space="preserve">20% of my data </w:t>
+      </w:r>
+      <w:proofErr w:type="gramStart"/>
+      <w:r>
+        <w:t>set(</w:t>
+      </w:r>
+      <w:proofErr w:type="gramEnd"/>
       <w:r>
         <w:t xml:space="preserve">388 data points) </w:t>
       </w:r>
@@ -1934,12 +2175,17 @@
         <w:t xml:space="preserve">for use as test set. Then, </w:t>
       </w:r>
       <w:proofErr w:type="spellStart"/>
+      <w:proofErr w:type="gramStart"/>
       <w:r>
         <w:t>TimeSeriesSplit</w:t>
       </w:r>
       <w:proofErr w:type="spellEnd"/>
       <w:r>
-        <w:t xml:space="preserve">, </w:t>
+        <w:t>,</w:t>
+      </w:r>
+      <w:proofErr w:type="gramEnd"/>
+      <w:r>
+        <w:t xml:space="preserve"> </w:t>
       </w:r>
       <w:r>
         <w:t xml:space="preserve">creates </w:t>
@@ -1948,7 +2194,7 @@
         <w:t xml:space="preserve">five </w:t>
       </w:r>
       <w:r>
-        <w:t>training set/validation set splits</w:t>
+        <w:t>training/validation set splits</w:t>
       </w:r>
       <w:r>
         <w:t xml:space="preserve">, which are later used </w:t>
@@ -1993,10 +2239,18 @@
         <w:t xml:space="preserve">category lists of feature </w:t>
       </w:r>
       <w:r>
-        <w:t xml:space="preserve">names along with the number of lags </w:t>
-      </w:r>
-      <w:r>
-        <w:t xml:space="preserve"> as input to </w:t>
+        <w:t xml:space="preserve">names along with the number of </w:t>
+      </w:r>
+      <w:proofErr w:type="gramStart"/>
+      <w:r>
+        <w:t xml:space="preserve">lags </w:t>
+      </w:r>
+      <w:r>
+        <w:t xml:space="preserve"> as</w:t>
+      </w:r>
+      <w:proofErr w:type="gramEnd"/>
+      <w:r>
+        <w:t xml:space="preserve"> input to </w:t>
       </w:r>
       <w:r>
         <w:t xml:space="preserve">create </w:t>
@@ -2030,9 +2284,11 @@
       <w:r>
         <w:t xml:space="preserve"> </w:t>
       </w:r>
-      <w:r>
-        <w:t>Column Transformer</w:t>
-      </w:r>
+      <w:proofErr w:type="spellStart"/>
+      <w:r>
+        <w:t>ColumnTransformer</w:t>
+      </w:r>
+      <w:proofErr w:type="spellEnd"/>
       <w:r>
         <w:t xml:space="preserve">. </w:t>
       </w:r>
@@ -2062,10 +2318,19 @@
         <w:t xml:space="preserve">e. </w:t>
       </w:r>
       <w:r>
-        <w:t xml:space="preserve">the columns are passed through a sine and cosine function to create new features that depict </w:t>
-      </w:r>
-      <w:r>
-        <w:t xml:space="preserve">month and weekday cycles while allowing to model to </w:t>
+        <w:t>That encoder passes columns</w:t>
+      </w:r>
+      <w:r>
+        <w:t xml:space="preserve"> through a sine and cosine function to create new features that depict </w:t>
+      </w:r>
+      <w:r>
+        <w:t>month and weekday cycles while allowing t</w:t>
+      </w:r>
+      <w:r>
+        <w:t>he</w:t>
+      </w:r>
+      <w:r>
+        <w:t xml:space="preserve"> model to </w:t>
       </w:r>
       <w:r>
         <w:t xml:space="preserve">still pinpoint a difference in values at </w:t>
@@ -2074,20 +2339,24 @@
         <w:t>close</w:t>
       </w:r>
       <w:r>
-        <w:t xml:space="preserve"> point of a cycle. </w:t>
+        <w:t xml:space="preserve"> point</w:t>
+      </w:r>
+      <w:r>
+        <w:t>s</w:t>
+      </w:r>
+      <w:r>
+        <w:t xml:space="preserve"> of a cycle. </w:t>
       </w:r>
       <w:r>
         <w:t>The table below depicts encoders used</w:t>
       </w:r>
     </w:p>
-    <w:p>
-      <w:r>
-        <w:t xml:space="preserve"> </w:t>
-      </w:r>
-      <w:r>
-        <w:t>Table2:</w:t>
-      </w:r>
-    </w:p>
+    <w:p/>
+    <w:p/>
+    <w:p/>
+    <w:p/>
+    <w:p/>
+    <w:p/>
     <w:tbl>
       <w:tblPr>
         <w:tblStyle w:val="TableGrid"/>
@@ -2274,8 +2543,13 @@
       </w:pPr>
     </w:p>
     <w:p>
-      <w:r>
-        <w:t xml:space="preserve">An </w:t>
+      <w:proofErr w:type="gramStart"/>
+      <w:r>
+        <w:t>An</w:t>
+      </w:r>
+      <w:proofErr w:type="gramEnd"/>
+      <w:r>
+        <w:t xml:space="preserve"> </w:t>
       </w:r>
       <w:proofErr w:type="spellStart"/>
       <w:r>
@@ -2324,6 +2598,7 @@
         <w:t>neg_root_mean_squared_error</w:t>
       </w:r>
       <w:proofErr w:type="spellEnd"/>
+      <w:proofErr w:type="gramStart"/>
       <w:r>
         <w:t>'</w:t>
       </w:r>
@@ -2331,7 +2606,11 @@
         <w:t xml:space="preserve"> </w:t>
       </w:r>
       <w:r>
-        <w:t xml:space="preserve">, with cv </w:t>
+        <w:t>,</w:t>
+      </w:r>
+      <w:proofErr w:type="gramEnd"/>
+      <w:r>
+        <w:t xml:space="preserve"> with cv </w:t>
       </w:r>
       <w:r>
         <w:t>as</w:t>
@@ -2348,25 +2627,57 @@
         <w:t xml:space="preserve"> with 5 splits.</w:t>
       </w:r>
       <w:r>
-        <w:t xml:space="preserve"> This is </w:t>
-      </w:r>
-      <w:r>
-        <w:t>fit on the dataset( without the test set)</w:t>
-      </w:r>
-      <w:r>
-        <w:t xml:space="preserve">. Then, the resulting best estimator </w:t>
+        <w:t xml:space="preserve"> This </w:t>
+      </w:r>
+      <w:proofErr w:type="gramStart"/>
+      <w:r>
+        <w:t xml:space="preserve">is </w:t>
+      </w:r>
+      <w:r>
+        <w:t>fit</w:t>
+      </w:r>
+      <w:proofErr w:type="gramEnd"/>
+      <w:r>
+        <w:t xml:space="preserve"> on the </w:t>
+      </w:r>
+      <w:proofErr w:type="gramStart"/>
+      <w:r>
+        <w:t>dataset( without</w:t>
+      </w:r>
+      <w:proofErr w:type="gramEnd"/>
+      <w:r>
+        <w:t xml:space="preserve"> the test set)</w:t>
+      </w:r>
+      <w:r>
+        <w:t xml:space="preserve">. Then, the resulting best </w:t>
+      </w:r>
+      <w:proofErr w:type="gramStart"/>
+      <w:r>
+        <w:t xml:space="preserve">estimator </w:t>
       </w:r>
       <w:r>
         <w:t xml:space="preserve"> </w:t>
       </w:r>
       <w:r>
-        <w:t xml:space="preserve">is used </w:t>
+        <w:t>is</w:t>
+      </w:r>
+      <w:proofErr w:type="gramEnd"/>
+      <w:r>
+        <w:t xml:space="preserve"> used </w:t>
       </w:r>
       <w:r>
         <w:t xml:space="preserve">to make predictions on the test set. With that, </w:t>
       </w:r>
       <w:r>
-        <w:t>a test score( Root mean Squared error) is evalu</w:t>
+        <w:t xml:space="preserve">a test </w:t>
+      </w:r>
+      <w:proofErr w:type="gramStart"/>
+      <w:r>
+        <w:t>score( Root</w:t>
+      </w:r>
+      <w:proofErr w:type="gramEnd"/>
+      <w:r>
+        <w:t xml:space="preserve"> mean Squared error) is evalu</w:t>
       </w:r>
       <w:r>
         <w:t xml:space="preserve">ated </w:t>
@@ -2375,7 +2686,15 @@
         <w:t xml:space="preserve">and </w:t>
       </w:r>
       <w:r>
-        <w:t xml:space="preserve">returned along with the fitted best estimator. </w:t>
+        <w:t xml:space="preserve">returned along with the </w:t>
+      </w:r>
+      <w:proofErr w:type="gramStart"/>
+      <w:r>
+        <w:t>fitted best</w:t>
+      </w:r>
+      <w:proofErr w:type="gramEnd"/>
+      <w:r>
+        <w:t xml:space="preserve"> estimator. </w:t>
       </w:r>
     </w:p>
     <w:p>
@@ -2407,8 +2726,13 @@
       <w:r>
         <w:t xml:space="preserve">its associated parameter grid, </w:t>
       </w:r>
-      <w:r>
-        <w:t xml:space="preserve">preprocessor , </w:t>
+      <w:proofErr w:type="gramStart"/>
+      <w:r>
+        <w:t>preprocessor ,</w:t>
+      </w:r>
+      <w:proofErr w:type="gramEnd"/>
+      <w:r>
+        <w:t xml:space="preserve"> </w:t>
       </w:r>
       <w:r>
         <w:t xml:space="preserve">splitting method, </w:t>
@@ -2434,16 +2758,27 @@
         <w:t>through.</w:t>
       </w:r>
       <w:r>
-        <w:t xml:space="preserve"> within each combination, </w:t>
-      </w:r>
-      <w:r>
-        <w:t xml:space="preserve">for each split obtained from the splitting method( </w:t>
+        <w:t xml:space="preserve"> </w:t>
+      </w:r>
+      <w:r>
+        <w:t>W</w:t>
+      </w:r>
+      <w:r>
+        <w:t xml:space="preserve">ithin each combination, </w:t>
+      </w:r>
+      <w:r>
+        <w:t xml:space="preserve">for each split obtained from the splitting </w:t>
+      </w:r>
+      <w:proofErr w:type="gramStart"/>
+      <w:r>
+        <w:t xml:space="preserve">method( </w:t>
       </w:r>
       <w:proofErr w:type="spellStart"/>
       <w:r>
         <w:t>TimeSeriesSplit</w:t>
       </w:r>
       <w:proofErr w:type="spellEnd"/>
+      <w:proofErr w:type="gramEnd"/>
       <w:r>
         <w:t xml:space="preserve">), </w:t>
       </w:r>
@@ -2470,13 +2805,21 @@
       </w:r>
       <w:proofErr w:type="spellEnd"/>
       <w:r>
-        <w:t xml:space="preserve"> model is trained on the training set and </w:t>
+        <w:t xml:space="preserve"> model is trained on the training set </w:t>
+      </w:r>
+      <w:proofErr w:type="gramStart"/>
+      <w:r>
+        <w:t xml:space="preserve">and </w:t>
       </w:r>
       <w:r>
         <w:t xml:space="preserve"> </w:t>
       </w:r>
       <w:r>
-        <w:t xml:space="preserve">error </w:t>
+        <w:t>error</w:t>
+      </w:r>
+      <w:proofErr w:type="gramEnd"/>
+      <w:r>
+        <w:t xml:space="preserve"> </w:t>
       </w:r>
       <w:r>
         <w:t xml:space="preserve">scores are evaluated from its prediction on the validation set. </w:t>
@@ -2488,10 +2831,18 @@
         <w:t xml:space="preserve">d the lowest </w:t>
       </w:r>
       <w:r>
-        <w:t xml:space="preserve">score is </w:t>
-      </w:r>
-      <w:r>
-        <w:t xml:space="preserve"> then returned</w:t>
+        <w:t xml:space="preserve">score </w:t>
+      </w:r>
+      <w:proofErr w:type="gramStart"/>
+      <w:r>
+        <w:t xml:space="preserve">is </w:t>
+      </w:r>
+      <w:r>
+        <w:t xml:space="preserve"> then</w:t>
+      </w:r>
+      <w:proofErr w:type="gramEnd"/>
+      <w:r>
+        <w:t xml:space="preserve"> returned</w:t>
       </w:r>
       <w:r>
         <w:t xml:space="preserve">, </w:t>
@@ -2511,21 +2862,45 @@
         <w:t xml:space="preserve"> set, and used to get </w:t>
       </w:r>
       <w:r>
-        <w:t>the root mean squared error .</w:t>
-      </w:r>
-    </w:p>
-    <w:p>
-      <w:r>
-        <w:t>The best Root Mean square error</w:t>
-      </w:r>
-      <w:r>
-        <w:t xml:space="preserve">(RMSE) </w:t>
+        <w:t xml:space="preserve">the </w:t>
+      </w:r>
+      <w:r>
+        <w:t xml:space="preserve">RMSE from predictions on the test </w:t>
+      </w:r>
+      <w:proofErr w:type="gramStart"/>
+      <w:r>
+        <w:t>set</w:t>
+      </w:r>
+      <w:r>
+        <w:t xml:space="preserve"> .</w:t>
+      </w:r>
+      <w:proofErr w:type="gramEnd"/>
+    </w:p>
+    <w:p>
+      <w:r>
+        <w:t xml:space="preserve">The best Root Mean square </w:t>
+      </w:r>
+      <w:proofErr w:type="gramStart"/>
+      <w:r>
+        <w:t>error</w:t>
+      </w:r>
+      <w:r>
+        <w:t>(</w:t>
+      </w:r>
+      <w:proofErr w:type="gramEnd"/>
+      <w:r>
+        <w:t xml:space="preserve">RMSE) </w:t>
       </w:r>
       <w:r>
         <w:t xml:space="preserve">obtained for all the models are compared to </w:t>
       </w:r>
-      <w:r>
-        <w:t xml:space="preserve">determine the best model for the project’s </w:t>
+      <w:proofErr w:type="gramStart"/>
+      <w:r>
+        <w:t>determine</w:t>
+      </w:r>
+      <w:proofErr w:type="gramEnd"/>
+      <w:r>
+        <w:t xml:space="preserve"> the best model for the project’s </w:t>
       </w:r>
       <w:r>
         <w:t>use case</w:t>
@@ -2549,14 +2924,15 @@
         <w:t>true target variable values.</w:t>
       </w:r>
     </w:p>
-    <w:p>
-      <w:r>
+    <w:p/>
+    <w:p/>
+    <w:p/>
+    <w:p/>
+    <w:p/>
+    <w:p>
+      <w:r>
+        <w:lastRenderedPageBreak/>
         <w:t>The hyperparameters used for each model are summarized below:</w:t>
-      </w:r>
-    </w:p>
-    <w:p>
-      <w:r>
-        <w:t>Table3:</w:t>
       </w:r>
     </w:p>
     <w:tbl>
@@ -2636,10 +3012,12 @@
               <w:t xml:space="preserve">: </w:t>
             </w:r>
             <w:proofErr w:type="spellStart"/>
+            <w:proofErr w:type="gramStart"/>
             <w:r>
               <w:t>np.logspace</w:t>
             </w:r>
             <w:proofErr w:type="spellEnd"/>
+            <w:proofErr w:type="gramEnd"/>
             <w:r>
               <w:t>(-3, 3, 7)</w:t>
             </w:r>
@@ -2676,18 +3054,25 @@
               <w:t xml:space="preserve">Alpha:  </w:t>
             </w:r>
             <w:proofErr w:type="spellStart"/>
+            <w:proofErr w:type="gramStart"/>
             <w:r>
               <w:t>np.logspace</w:t>
             </w:r>
             <w:proofErr w:type="spellEnd"/>
+            <w:proofErr w:type="gramEnd"/>
             <w:r>
               <w:t>(-3, 3, 7)</w:t>
             </w:r>
           </w:p>
           <w:p>
             <w:r>
-              <w:t>solver:  saga</w:t>
-            </w:r>
+              <w:t>solver</w:t>
+            </w:r>
+            <w:proofErr w:type="gramStart"/>
+            <w:r>
+              <w:t>:  saga</w:t>
+            </w:r>
+            <w:proofErr w:type="gramEnd"/>
           </w:p>
           <w:p>
             <w:proofErr w:type="spellStart"/>
@@ -2783,8 +3168,13 @@
               <w:t>'</w:t>
             </w:r>
             <w:proofErr w:type="spellStart"/>
-            <w:r>
-              <w:t>max_depth</w:t>
+            <w:proofErr w:type="gramStart"/>
+            <w:r>
+              <w:t>max</w:t>
+            </w:r>
+            <w:proofErr w:type="gramEnd"/>
+            <w:r>
+              <w:t>_depth</w:t>
             </w:r>
             <w:proofErr w:type="spellEnd"/>
             <w:r>
@@ -2793,7 +3183,6 @@
           </w:p>
           <w:p>
             <w:r>
-              <w:lastRenderedPageBreak/>
               <w:t>'seed': [0]</w:t>
             </w:r>
           </w:p>
@@ -2802,8 +3191,13 @@
               <w:t>'</w:t>
             </w:r>
             <w:proofErr w:type="spellStart"/>
-            <w:r>
-              <w:t>learning_rate</w:t>
+            <w:proofErr w:type="gramStart"/>
+            <w:r>
+              <w:t>learning</w:t>
+            </w:r>
+            <w:proofErr w:type="gramEnd"/>
+            <w:r>
+              <w:t>_rate</w:t>
             </w:r>
             <w:proofErr w:type="spellEnd"/>
             <w:r>
@@ -2812,7 +3206,15 @@
           </w:p>
           <w:p>
             <w:r>
-              <w:t>'subsample' : [0.66]</w:t>
+              <w:t>'subsample</w:t>
+            </w:r>
+            <w:proofErr w:type="gramStart"/>
+            <w:r>
+              <w:t>' :</w:t>
+            </w:r>
+            <w:proofErr w:type="gramEnd"/>
+            <w:r>
+              <w:t xml:space="preserve"> [0.66]</w:t>
             </w:r>
           </w:p>
           <w:p>
@@ -2820,8 +3222,13 @@
               <w:t>'</w:t>
             </w:r>
             <w:proofErr w:type="spellStart"/>
-            <w:r>
-              <w:t>colsample_bytree</w:t>
+            <w:proofErr w:type="gramStart"/>
+            <w:r>
+              <w:t>colsample</w:t>
+            </w:r>
+            <w:proofErr w:type="gramEnd"/>
+            <w:r>
+              <w:t>_bytree</w:t>
             </w:r>
             <w:proofErr w:type="spellEnd"/>
             <w:r>
@@ -2864,7 +3271,15 @@
     </w:p>
     <w:p>
       <w:r>
-        <w:t xml:space="preserve">Maximum iteration is the number of tries the model has to converge </w:t>
+        <w:t xml:space="preserve">Maximum iteration is the number of tries the model </w:t>
+      </w:r>
+      <w:proofErr w:type="gramStart"/>
+      <w:r>
+        <w:t>has to</w:t>
+      </w:r>
+      <w:proofErr w:type="gramEnd"/>
+      <w:r>
+        <w:t xml:space="preserve"> converge </w:t>
       </w:r>
       <w:r>
         <w:t>and is set to 10000 overall.</w:t>
@@ -2900,7 +3315,15 @@
       </w:r>
       <w:proofErr w:type="spellEnd"/>
       <w:r>
-        <w:t xml:space="preserve"> parameter for Random forest </w:t>
+        <w:t xml:space="preserve"> parameter for </w:t>
+      </w:r>
+      <w:proofErr w:type="gramStart"/>
+      <w:r>
+        <w:t>Random forest</w:t>
+      </w:r>
+      <w:proofErr w:type="gramEnd"/>
+      <w:r>
+        <w:t xml:space="preserve"> </w:t>
       </w:r>
       <w:r>
         <w:t xml:space="preserve">and </w:t>
@@ -3001,6 +3424,7 @@
     </w:p>
     <w:p>
       <w:r>
+        <w:lastRenderedPageBreak/>
         <w:t xml:space="preserve">The </w:t>
       </w:r>
       <w:r>
@@ -3044,68 +3468,31 @@
         <w:t xml:space="preserve">shows the effect of </w:t>
       </w:r>
       <w:r>
-        <w:t xml:space="preserve">the splitting strategy </w:t>
-      </w:r>
-      <w:r>
-        <w:t>and non deterministic ML models on the evaluation metric</w:t>
+        <w:t>the splitting strategy</w:t>
+      </w:r>
+      <w:r>
+        <w:t>,</w:t>
+      </w:r>
+      <w:r>
+        <w:t xml:space="preserve"> </w:t>
+      </w:r>
+      <w:r>
+        <w:t xml:space="preserve">and </w:t>
+      </w:r>
+      <w:r>
+        <w:t>nondeterministic</w:t>
+      </w:r>
+      <w:r>
+        <w:t xml:space="preserve"> ML models on the evaluation metric</w:t>
       </w:r>
       <w:r>
         <w:t>.</w:t>
       </w:r>
     </w:p>
     <w:p/>
-    <w:p/>
-    <w:p/>
-    <w:p/>
-    <w:p/>
-    <w:p>
-      <w:r>
-        <w:t xml:space="preserve">Table4: </w:t>
-      </w:r>
-      <w:r>
-        <w:t xml:space="preserve">random state and splitting strategy effect on evaluation metric(RMSE) </w:t>
-      </w:r>
-    </w:p>
-    <w:p>
-      <w:r>
-        <w:t xml:space="preserve">                After iterating through random states:</w:t>
-      </w:r>
-      <w:r>
-        <w:t xml:space="preserve"> [</w:t>
-      </w:r>
-      <w:r>
-        <w:t xml:space="preserve">10,30, 45, 50], </w:t>
-      </w:r>
-      <w:r>
-        <w:t xml:space="preserve">and </w:t>
-      </w:r>
-      <w:proofErr w:type="spellStart"/>
-      <w:r>
-        <w:t>timeseriesspli</w:t>
-      </w:r>
-      <w:r>
-        <w:t>t</w:t>
-      </w:r>
-      <w:proofErr w:type="spellEnd"/>
-    </w:p>
-    <w:p>
-      <w:r>
-        <w:t xml:space="preserve">               With </w:t>
-      </w:r>
-      <w:proofErr w:type="spellStart"/>
-      <w:r>
-        <w:t>n_splits</w:t>
-      </w:r>
-      <w:proofErr w:type="spellEnd"/>
-      <w:r>
-        <w:t xml:space="preserve">: </w:t>
-      </w:r>
-      <w:r>
-        <w:t>[3, 4, 5, 6]</w:t>
-      </w:r>
-    </w:p>
     <w:tbl>
       <w:tblPr>
+        <w:tblpPr w:leftFromText="180" w:rightFromText="180" w:vertAnchor="text" w:horzAnchor="margin" w:tblpXSpec="center" w:tblpY="-1"/>
         <w:tblW w:w="7652" w:type="dxa"/>
         <w:tblLook w:val="04A0" w:firstRow="1" w:lastRow="0" w:firstColumn="1" w:lastColumn="0" w:noHBand="0" w:noVBand="1"/>
       </w:tblPr>
@@ -3782,21 +4169,143 @@
         </w:tc>
       </w:tr>
     </w:tbl>
+    <w:p>
+      <w:r>
+        <w:t xml:space="preserve">                </w:t>
+      </w:r>
+    </w:p>
     <w:p/>
+    <w:p/>
+    <w:p/>
+    <w:p/>
+    <w:p/>
     <w:p>
       <w:pPr>
+        <w:jc w:val="center"/>
         <w:rPr>
-          <w:color w:val="EE0000"/>
+          <w:i/>
+          <w:iCs/>
+          <w:sz w:val="20"/>
+          <w:szCs w:val="20"/>
         </w:rPr>
       </w:pPr>
+      <w:r>
+        <w:rPr>
+          <w:i/>
+          <w:iCs/>
+          <w:sz w:val="20"/>
+          <w:szCs w:val="20"/>
+        </w:rPr>
+        <w:t xml:space="preserve">Note: </w:t>
+      </w:r>
+      <w:r>
+        <w:rPr>
+          <w:i/>
+          <w:iCs/>
+          <w:sz w:val="20"/>
+          <w:szCs w:val="20"/>
+        </w:rPr>
+        <w:t>table data obtained a</w:t>
+      </w:r>
+      <w:r>
+        <w:rPr>
+          <w:i/>
+          <w:iCs/>
+          <w:sz w:val="20"/>
+          <w:szCs w:val="20"/>
+        </w:rPr>
+        <w:t xml:space="preserve">fter </w:t>
+      </w:r>
+      <w:r>
+        <w:rPr>
+          <w:i/>
+          <w:iCs/>
+          <w:sz w:val="20"/>
+          <w:szCs w:val="20"/>
+        </w:rPr>
+        <w:t>iterating through random states:</w:t>
+      </w:r>
+      <w:r>
+        <w:rPr>
+          <w:i/>
+          <w:iCs/>
+          <w:sz w:val="20"/>
+          <w:szCs w:val="20"/>
+        </w:rPr>
+        <w:t xml:space="preserve"> [</w:t>
+      </w:r>
+      <w:r>
+        <w:rPr>
+          <w:i/>
+          <w:iCs/>
+          <w:sz w:val="20"/>
+          <w:szCs w:val="20"/>
+        </w:rPr>
+        <w:t xml:space="preserve">10,30, 45, 50], </w:t>
+      </w:r>
+      <w:r>
+        <w:rPr>
+          <w:i/>
+          <w:iCs/>
+          <w:sz w:val="20"/>
+          <w:szCs w:val="20"/>
+        </w:rPr>
+        <w:t xml:space="preserve">and </w:t>
+      </w:r>
+      <w:r>
+        <w:rPr>
+          <w:i/>
+          <w:iCs/>
+          <w:sz w:val="20"/>
+          <w:szCs w:val="20"/>
+        </w:rPr>
+        <w:t>timeseries split w</w:t>
+      </w:r>
+      <w:r>
+        <w:rPr>
+          <w:i/>
+          <w:iCs/>
+          <w:sz w:val="20"/>
+          <w:szCs w:val="20"/>
+        </w:rPr>
+        <w:t xml:space="preserve">ith </w:t>
+      </w:r>
+      <w:proofErr w:type="spellStart"/>
+      <w:r>
+        <w:rPr>
+          <w:i/>
+          <w:iCs/>
+          <w:sz w:val="20"/>
+          <w:szCs w:val="20"/>
+        </w:rPr>
+        <w:t>n_splits</w:t>
+      </w:r>
+      <w:proofErr w:type="spellEnd"/>
+      <w:r>
+        <w:rPr>
+          <w:i/>
+          <w:iCs/>
+          <w:sz w:val="20"/>
+          <w:szCs w:val="20"/>
+        </w:rPr>
+        <w:t xml:space="preserve">: </w:t>
+      </w:r>
+      <w:r>
+        <w:rPr>
+          <w:i/>
+          <w:iCs/>
+          <w:sz w:val="20"/>
+          <w:szCs w:val="20"/>
+        </w:rPr>
+        <w:t>[3, 4, 5, 6]</w:t>
+      </w:r>
     </w:p>
     <w:p/>
     <w:p>
-      <w:r>
-        <w:rPr>
-          <w:b/>
-          <w:bCs/>
-        </w:rPr>
+      <w:pPr>
+        <w:pStyle w:val="Heading1"/>
+      </w:pPr>
+      <w:r>
         <w:t xml:space="preserve">Results </w:t>
       </w:r>
     </w:p>
@@ -3819,23 +4328,10 @@
     </w:p>
     <w:p/>
     <w:p/>
-    <w:p>
-      <w:r>
-        <w:t xml:space="preserve">Table5: </w:t>
-      </w:r>
-      <w:r>
-        <w:t xml:space="preserve">Table shows Each model’s test score(RMSE) and </w:t>
-      </w:r>
-      <w:r>
-        <w:t xml:space="preserve">how </w:t>
-      </w:r>
-      <w:r>
-        <w:t>far below the baseline it is.</w:t>
-      </w:r>
-    </w:p>
     <w:tbl>
       <w:tblPr>
         <w:tblW w:w="8780" w:type="dxa"/>
+        <w:jc w:val="center"/>
         <w:tblLook w:val="04A0" w:firstRow="1" w:lastRow="0" w:firstColumn="1" w:lastColumn="0" w:noHBand="0" w:noVBand="1"/>
       </w:tblPr>
       <w:tblGrid>
@@ -3846,6 +4342,7 @@
       <w:tr>
         <w:trPr>
           <w:trHeight w:val="285"/>
+          <w:jc w:val="center"/>
         </w:trPr>
         <w:tc>
           <w:tcPr>
@@ -3925,7 +4422,33 @@
                 <w:szCs w:val="22"/>
                 <w14:ligatures w14:val="none"/>
               </w:rPr>
-              <w:t>Test score(RMSE)</w:t>
+              <w:t xml:space="preserve">Test </w:t>
+            </w:r>
+            <w:proofErr w:type="gramStart"/>
+            <w:r>
+              <w:rPr>
+                <w:rFonts w:ascii="Calibri" w:eastAsia="Times New Roman" w:hAnsi="Calibri" w:cs="Calibri"/>
+                <w:b/>
+                <w:bCs/>
+                <w:kern w:val="0"/>
+                <w:sz w:val="22"/>
+                <w:szCs w:val="22"/>
+                <w14:ligatures w14:val="none"/>
+              </w:rPr>
+              <w:t>score(</w:t>
+            </w:r>
+            <w:proofErr w:type="gramEnd"/>
+            <w:r>
+              <w:rPr>
+                <w:rFonts w:ascii="Calibri" w:eastAsia="Times New Roman" w:hAnsi="Calibri" w:cs="Calibri"/>
+                <w:b/>
+                <w:bCs/>
+                <w:kern w:val="0"/>
+                <w:sz w:val="22"/>
+                <w:szCs w:val="22"/>
+                <w14:ligatures w14:val="none"/>
+              </w:rPr>
+              <w:t>RMSE)</w:t>
             </w:r>
           </w:p>
         </w:tc>
@@ -3966,8 +4489,9 @@
                 <w:szCs w:val="22"/>
                 <w14:ligatures w14:val="none"/>
               </w:rPr>
-              <w:t>Distance from Baseline</w:t>
-            </w:r>
+              <w:t xml:space="preserve">Distance from </w:t>
+            </w:r>
+            <w:proofErr w:type="gramStart"/>
             <w:r>
               <w:rPr>
                 <w:rFonts w:ascii="Calibri" w:eastAsia="Times New Roman" w:hAnsi="Calibri" w:cs="Calibri"/>
@@ -3978,7 +4502,32 @@
                 <w:szCs w:val="22"/>
                 <w14:ligatures w14:val="none"/>
               </w:rPr>
-              <w:t>(STDEV)</w:t>
+              <w:t>Baseline</w:t>
+            </w:r>
+            <w:r>
+              <w:rPr>
+                <w:rFonts w:ascii="Calibri" w:eastAsia="Times New Roman" w:hAnsi="Calibri" w:cs="Calibri"/>
+                <w:b/>
+                <w:bCs/>
+                <w:kern w:val="0"/>
+                <w:sz w:val="22"/>
+                <w:szCs w:val="22"/>
+                <w14:ligatures w14:val="none"/>
+              </w:rPr>
+              <w:t>(</w:t>
+            </w:r>
+            <w:proofErr w:type="gramEnd"/>
+            <w:r>
+              <w:rPr>
+                <w:rFonts w:ascii="Calibri" w:eastAsia="Times New Roman" w:hAnsi="Calibri" w:cs="Calibri"/>
+                <w:b/>
+                <w:bCs/>
+                <w:kern w:val="0"/>
+                <w:sz w:val="22"/>
+                <w:szCs w:val="22"/>
+                <w14:ligatures w14:val="none"/>
+              </w:rPr>
+              <w:t>STDEV)</w:t>
             </w:r>
           </w:p>
         </w:tc>
@@ -3986,6 +4535,7 @@
       <w:tr>
         <w:trPr>
           <w:trHeight w:val="285"/>
+          <w:jc w:val="center"/>
         </w:trPr>
         <w:tc>
           <w:tcPr>
@@ -4108,6 +4658,7 @@
       <w:tr>
         <w:trPr>
           <w:trHeight w:val="285"/>
+          <w:jc w:val="center"/>
         </w:trPr>
         <w:tc>
           <w:tcPr>
@@ -4230,6 +4781,7 @@
       <w:tr>
         <w:trPr>
           <w:trHeight w:val="285"/>
+          <w:jc w:val="center"/>
         </w:trPr>
         <w:tc>
           <w:tcPr>
@@ -4352,6 +4904,7 @@
       <w:tr>
         <w:trPr>
           <w:trHeight w:val="285"/>
+          <w:jc w:val="center"/>
         </w:trPr>
         <w:tc>
           <w:tcPr>
@@ -4475,9 +5028,21 @@
       </w:tr>
     </w:tbl>
     <w:p/>
-    <w:p>
-      <w:r>
-        <w:t xml:space="preserve">The most predictive models were Linear regression with L1 regularization and Random Forest with the earlier having the </w:t>
+    <w:p/>
+    <w:p/>
+    <w:p>
+      <w:r>
+        <w:lastRenderedPageBreak/>
+        <w:t xml:space="preserve">The most predictive models were Linear regression with L1 regularization and Random Forest with the </w:t>
+      </w:r>
+      <w:r>
+        <w:t xml:space="preserve">former </w:t>
+      </w:r>
+      <w:r>
+        <w:t>achieving</w:t>
+      </w:r>
+      <w:r>
+        <w:t xml:space="preserve"> the </w:t>
       </w:r>
       <w:r>
         <w:t xml:space="preserve">lowest </w:t>
@@ -4498,20 +5063,31 @@
     </w:p>
     <w:p>
       <w:r>
-        <w:lastRenderedPageBreak/>
         <w:t>The following figures demonstrate global importance measurements of all the features</w:t>
       </w:r>
       <w:r>
         <w:t xml:space="preserve">, with </w:t>
       </w:r>
       <w:r>
-        <w:t xml:space="preserve">sales _Quantity </w:t>
-      </w:r>
-      <w:r>
-        <w:t xml:space="preserve">a day prior seeming to be the most predictive feature. </w:t>
-      </w:r>
-    </w:p>
-    <w:p>
+        <w:t xml:space="preserve">sales </w:t>
+      </w:r>
+      <w:r>
+        <w:t>q</w:t>
+      </w:r>
+      <w:r>
+        <w:t xml:space="preserve">uantity </w:t>
+      </w:r>
+      <w:r>
+        <w:t>one</w:t>
+      </w:r>
+      <w:r>
+        <w:t xml:space="preserve"> day prior seeming to be the most predictive feature. </w:t>
+      </w:r>
+    </w:p>
+    <w:p>
+      <w:pPr>
+        <w:jc w:val="center"/>
+      </w:pPr>
       <w:r>
         <w:rPr>
           <w:noProof/>
@@ -4559,25 +5135,36 @@
         </w:drawing>
       </w:r>
     </w:p>
-    <w:p/>
     <w:p>
       <w:pPr>
         <w:pStyle w:val="Caption"/>
+        <w:jc w:val="center"/>
       </w:pPr>
       <w:r>
-        <w:t>Figure: Coefficients of  Top 10 most important features in the most predictive model Lasso Regression</w:t>
-      </w:r>
-    </w:p>
-    <w:p>
+        <w:t xml:space="preserve">Figure: Coefficients </w:t>
+      </w:r>
+      <w:proofErr w:type="gramStart"/>
+      <w:r>
+        <w:t>of  Top</w:t>
+      </w:r>
+      <w:proofErr w:type="gramEnd"/>
+      <w:r>
+        <w:t xml:space="preserve"> 10 most important features in the most predictive model Lasso Regression</w:t>
+      </w:r>
+    </w:p>
+    <w:p>
+      <w:pPr>
+        <w:jc w:val="center"/>
+      </w:pPr>
       <w:r>
         <w:rPr>
           <w:noProof/>
         </w:rPr>
         <w:lastRenderedPageBreak/>
         <w:drawing>
-          <wp:inline distT="0" distB="0" distL="0" distR="0" wp14:anchorId="51AD237B" wp14:editId="4732A1BD">
-            <wp:extent cx="5818536" cy="4363902"/>
-            <wp:effectExtent l="0" t="0" r="0" b="0"/>
+          <wp:inline distT="0" distB="0" distL="0" distR="0" wp14:anchorId="51AD237B" wp14:editId="4C2C1350">
+            <wp:extent cx="5707117" cy="4280338"/>
+            <wp:effectExtent l="0" t="0" r="8255" b="6350"/>
             <wp:docPr id="1768116976" name="Picture 6" descr="A screenshot of a graph&#10;&#10;AI-generated content may be incorrect."/>
             <wp:cNvGraphicFramePr>
               <a:graphicFrameLocks xmlns:a="http://schemas.openxmlformats.org/drawingml/2006/main" noChangeAspect="1"/>
@@ -4604,7 +5191,7 @@
                   <pic:spPr>
                     <a:xfrm>
                       <a:off x="0" y="0"/>
-                      <a:ext cx="5823424" cy="4367568"/>
+                      <a:ext cx="5713055" cy="4284791"/>
                     </a:xfrm>
                     <a:prstGeom prst="rect">
                       <a:avLst/>
@@ -4620,6 +5207,7 @@
     <w:p>
       <w:pPr>
         <w:pStyle w:val="Caption"/>
+        <w:jc w:val="center"/>
       </w:pPr>
       <w:r>
         <w:t xml:space="preserve">Figure: </w:t>
@@ -4629,6 +5217,9 @@
       </w:r>
     </w:p>
     <w:p>
+      <w:pPr>
+        <w:jc w:val="center"/>
+      </w:pPr>
       <w:r>
         <w:rPr>
           <w:noProof/>
@@ -4679,15 +5270,31 @@
     <w:p>
       <w:pPr>
         <w:pStyle w:val="Caption"/>
+        <w:jc w:val="center"/>
       </w:pPr>
       <w:r>
         <w:t>Figure: Top 10 features in the most predictive model. Evaluation was made using SHAP</w:t>
       </w:r>
     </w:p>
-    <w:p/>
-    <w:p/>
-    <w:p/>
-    <w:p>
+    <w:p>
+      <w:pPr>
+        <w:jc w:val="center"/>
+      </w:pPr>
+    </w:p>
+    <w:p>
+      <w:pPr>
+        <w:jc w:val="center"/>
+      </w:pPr>
+    </w:p>
+    <w:p>
+      <w:pPr>
+        <w:jc w:val="center"/>
+      </w:pPr>
+    </w:p>
+    <w:p>
+      <w:pPr>
+        <w:jc w:val="center"/>
+      </w:pPr>
       <w:r>
         <w:rPr>
           <w:noProof/>
@@ -4738,6 +5345,7 @@
     <w:p>
       <w:pPr>
         <w:pStyle w:val="Caption"/>
+        <w:jc w:val="center"/>
       </w:pPr>
       <w:r>
         <w:t>Figure: Most predictive features in the 99</w:t>
@@ -4749,7 +5357,7 @@
         <w:t>th</w:t>
       </w:r>
       <w:r>
-        <w:t xml:space="preserve"> data point in data set . </w:t>
+        <w:t xml:space="preserve"> data point in dataset.</w:t>
       </w:r>
     </w:p>
     <w:p/>
@@ -4758,91 +5366,126 @@
         <w:t xml:space="preserve">From the model interpretation plots for both local and global feature importance, generally, one can say for a specific day, </w:t>
       </w:r>
       <w:r>
-        <w:t xml:space="preserve">using the most predictive model in this project, sales within the 7 days </w:t>
-      </w:r>
-      <w:r>
-        <w:t xml:space="preserve">prior </w:t>
-      </w:r>
-      <w:r>
-        <w:t xml:space="preserve"> and about a month prior(22 days earlier) </w:t>
-      </w:r>
-      <w:r>
-        <w:t>are very important in making predictions.</w:t>
-      </w:r>
-    </w:p>
-    <w:p>
-      <w:r>
-        <w:t xml:space="preserve">On the other hand, </w:t>
+        <w:t xml:space="preserve">using the most predictive model in this project, sales within </w:t>
+      </w:r>
+      <w:proofErr w:type="gramStart"/>
+      <w:r>
+        <w:t>the 7</w:t>
+      </w:r>
+      <w:proofErr w:type="gramEnd"/>
+      <w:r>
+        <w:t xml:space="preserve"> days </w:t>
+      </w:r>
+      <w:r>
+        <w:t>prior and</w:t>
+      </w:r>
+      <w:r>
+        <w:t xml:space="preserve"> about a month </w:t>
+      </w:r>
+      <w:proofErr w:type="gramStart"/>
+      <w:r>
+        <w:t>prior(</w:t>
+      </w:r>
+      <w:proofErr w:type="gramEnd"/>
+      <w:r>
+        <w:t xml:space="preserve">22 days earlier) </w:t>
+      </w:r>
+      <w:r>
+        <w:t xml:space="preserve">are very important in </w:t>
+      </w:r>
+      <w:r>
+        <w:t>the model’s predictions.</w:t>
+      </w:r>
+    </w:p>
+    <w:p>
+      <w:r>
+        <w:t xml:space="preserve">On the other </w:t>
+      </w:r>
+      <w:r>
+        <w:t>hand, the</w:t>
+      </w:r>
+      <w:r>
+        <w:t xml:space="preserve"> least important features </w:t>
+      </w:r>
+      <w:r>
+        <w:t xml:space="preserve">are many. Several features </w:t>
+      </w:r>
+      <w:r>
+        <w:t>seem to ba</w:t>
+      </w:r>
+      <w:r>
+        <w:t>r</w:t>
+      </w:r>
+      <w:r>
+        <w:t>ely affect the targe</w:t>
+      </w:r>
+      <w:r>
+        <w:t>t variable</w:t>
+      </w:r>
+      <w:r>
+        <w:t xml:space="preserve">, if at all. Among the least important features, the ones that </w:t>
+      </w:r>
+      <w:r>
+        <w:t xml:space="preserve">provide some sort of effect </w:t>
+      </w:r>
+      <w:r>
+        <w:t>are event</w:t>
+      </w:r>
+      <w:r>
+        <w:t>_name_1_lag_50_</w:t>
+      </w:r>
+      <w:r>
+        <w:t xml:space="preserve">NBAFinalsStart, </w:t>
+      </w:r>
+      <w:r>
+        <w:t>Sales quantity_lag</w:t>
+      </w:r>
+      <w:proofErr w:type="gramStart"/>
+      <w:r>
+        <w:t>56( over</w:t>
+      </w:r>
+      <w:proofErr w:type="gramEnd"/>
+      <w:r>
+        <w:t xml:space="preserve"> a mon</w:t>
+      </w:r>
+      <w:r>
+        <w:t>th</w:t>
+      </w:r>
+      <w:r>
+        <w:t xml:space="preserve"> ago)</w:t>
+      </w:r>
+      <w:r>
+        <w:t>,</w:t>
+      </w:r>
+      <w:r>
+        <w:t xml:space="preserve"> and</w:t>
       </w:r>
       <w:r>
         <w:t xml:space="preserve"> </w:t>
       </w:r>
       <w:r>
-        <w:t xml:space="preserve">The least important features </w:t>
-      </w:r>
-      <w:r>
-        <w:t xml:space="preserve">are many. Several features </w:t>
-      </w:r>
-      <w:r>
-        <w:t>seem to ba</w:t>
-      </w:r>
-      <w:r>
-        <w:t>r</w:t>
-      </w:r>
-      <w:r>
-        <w:t>ely affect the targe</w:t>
-      </w:r>
-      <w:r>
-        <w:t>t variable</w:t>
-      </w:r>
-      <w:r>
-        <w:t xml:space="preserve">, if at all. Among the least important features, the ones that </w:t>
-      </w:r>
-      <w:r>
-        <w:t>provide some sort of effect are</w:t>
+        <w:t>Sales_Quantity_lag14(two weeks prior)</w:t>
+      </w:r>
+      <w:r>
+        <w:t>.</w:t>
       </w:r>
       <w:r>
         <w:t xml:space="preserve"> </w:t>
       </w:r>
-      <w:r>
-        <w:t xml:space="preserve"> </w:t>
-      </w:r>
-      <w:r>
-        <w:t>event_name_1_lag_50_</w:t>
-      </w:r>
-      <w:r>
-        <w:t xml:space="preserve">NBAFinalsStart, </w:t>
-      </w:r>
-      <w:r>
-        <w:t>Sales quantity_lag56( over a mon</w:t>
-      </w:r>
-      <w:r>
-        <w:t>th</w:t>
-      </w:r>
-      <w:r>
-        <w:t xml:space="preserve"> ago)</w:t>
-      </w:r>
-      <w:r>
-        <w:t>,</w:t>
-      </w:r>
-      <w:r>
-        <w:t xml:space="preserve"> and</w:t>
-      </w:r>
-      <w:r>
-        <w:t xml:space="preserve"> </w:t>
-      </w:r>
-      <w:r>
-        <w:t>Sales_Quantity_lag14(two weeks prior)</w:t>
-      </w:r>
-      <w:r>
-        <w:t>.</w:t>
-      </w:r>
     </w:p>
     <w:p/>
     <w:p>
       <w:r>
         <w:lastRenderedPageBreak/>
-        <w:t xml:space="preserve">What’s surprising is the sheer number of features that did not provide any effect </w:t>
+        <w:t xml:space="preserve">What’s surprising is the sheer number of features that did not </w:t>
+      </w:r>
+      <w:proofErr w:type="gramStart"/>
+      <w:r>
+        <w:t>provide</w:t>
+      </w:r>
+      <w:proofErr w:type="gramEnd"/>
+      <w:r>
+        <w:t xml:space="preserve"> any effect </w:t>
       </w:r>
       <w:r>
         <w:t xml:space="preserve">or barely any </w:t>
@@ -4851,37 +5494,46 @@
         <w:t xml:space="preserve">in making predictions. During tuning, the </w:t>
       </w:r>
       <w:r>
-        <w:t xml:space="preserve">Lasso regression model required 128 lags for most features in order to reach the minimum RMSE . However, </w:t>
-      </w:r>
-      <w:r>
-        <w:t xml:space="preserve">when interpreting the models no feature anywhere near the 128 lag mark </w:t>
+        <w:t xml:space="preserve">Lasso regression model required 128 lags for most features </w:t>
+      </w:r>
+      <w:proofErr w:type="gramStart"/>
+      <w:r>
+        <w:t>in order to</w:t>
+      </w:r>
+      <w:proofErr w:type="gramEnd"/>
+      <w:r>
+        <w:t xml:space="preserve"> reach the minimum </w:t>
+      </w:r>
+      <w:proofErr w:type="gramStart"/>
+      <w:r>
+        <w:t>RMSE .</w:t>
+      </w:r>
+      <w:proofErr w:type="gramEnd"/>
+      <w:r>
+        <w:t xml:space="preserve"> However, </w:t>
+      </w:r>
+      <w:r>
+        <w:t xml:space="preserve">when interpreting the models no feature anywhere near the </w:t>
+      </w:r>
+      <w:proofErr w:type="gramStart"/>
+      <w:r>
+        <w:t>128 lag</w:t>
+      </w:r>
+      <w:proofErr w:type="gramEnd"/>
+      <w:r>
+        <w:t xml:space="preserve"> mark </w:t>
       </w:r>
       <w:r>
         <w:t>significantly impacted predictions.</w:t>
       </w:r>
-    </w:p>
-    <w:p>
-      <w:pPr>
-        <w:rPr>
-          <w:color w:val="EE0000"/>
-        </w:rPr>
-      </w:pPr>
-    </w:p>
-    <w:p>
-      <w:pPr>
-        <w:rPr>
-          <w:color w:val="EE0000"/>
-        </w:rPr>
-      </w:pPr>
     </w:p>
     <w:p/>
     <w:p/>
     <w:p>
-      <w:r>
-        <w:rPr>
-          <w:b/>
-          <w:bCs/>
-        </w:rPr>
+      <w:pPr>
+        <w:pStyle w:val="Heading1"/>
+      </w:pPr>
+      <w:r>
         <w:t xml:space="preserve">Outlook </w:t>
       </w:r>
     </w:p>
@@ -4947,7 +5599,13 @@
         <w:t>AR models assume a stationary dataset</w:t>
       </w:r>
       <w:r>
-        <w:t xml:space="preserve">, which is not the case in my data set due to changing </w:t>
+        <w:t xml:space="preserve">, which is not the case in my dataset due to </w:t>
+      </w:r>
+      <w:r>
+        <w:t xml:space="preserve">a </w:t>
+      </w:r>
+      <w:r>
+        <w:t xml:space="preserve">changing </w:t>
       </w:r>
       <w:r>
         <w:t>sales mean over time</w:t>
@@ -4965,10 +5623,19 @@
         <w:t xml:space="preserve">o make my models more predictive, </w:t>
       </w:r>
       <w:r>
-        <w:t xml:space="preserve">adding more useful features such as prediction error at each data point, </w:t>
-      </w:r>
-      <w:r>
-        <w:t xml:space="preserve">and replacing the lagged sales quantities by </w:t>
+        <w:t xml:space="preserve">adding </w:t>
+      </w:r>
+      <w:r>
+        <w:t xml:space="preserve">other </w:t>
+      </w:r>
+      <w:r>
+        <w:t>features such as prediction error at each data point,</w:t>
+      </w:r>
+      <w:r>
+        <w:t xml:space="preserve"> </w:t>
+      </w:r>
+      <w:r>
+        <w:t xml:space="preserve">replacing the lagged sales quantities by </w:t>
       </w:r>
       <w:r>
         <w:t xml:space="preserve">the </w:t>
@@ -4980,19 +5647,31 @@
         <w:t>change in sales</w:t>
       </w:r>
       <w:r>
+        <w:t>,</w:t>
+      </w:r>
+      <w:r>
         <w:t xml:space="preserve"> </w:t>
       </w:r>
       <w:r>
-        <w:t xml:space="preserve">and predicting the change in sales instead </w:t>
-      </w:r>
-      <w:r>
-        <w:t xml:space="preserve"> would </w:t>
+        <w:t xml:space="preserve">and predicting the change in sales </w:t>
+      </w:r>
+      <w:r>
+        <w:t>instead would</w:t>
+      </w:r>
+      <w:r>
+        <w:t xml:space="preserve"> </w:t>
       </w:r>
       <w:r>
         <w:t xml:space="preserve">be a great approach. </w:t>
       </w:r>
       <w:r>
-        <w:t xml:space="preserve">The result would be </w:t>
+        <w:t xml:space="preserve">The result would </w:t>
+      </w:r>
+      <w:r>
+        <w:t xml:space="preserve">then </w:t>
+      </w:r>
+      <w:r>
+        <w:t xml:space="preserve">be </w:t>
       </w:r>
       <w:r>
         <w:t xml:space="preserve">the sum of </w:t>
@@ -5039,7 +5718,13 @@
         <w:t xml:space="preserve">date. These are factors that often affect sales as hidden products or products not well known often </w:t>
       </w:r>
       <w:r>
-        <w:t>have less sales.</w:t>
+        <w:t>have l</w:t>
+      </w:r>
+      <w:r>
+        <w:t>ower</w:t>
+      </w:r>
+      <w:r>
+        <w:t xml:space="preserve"> sales.</w:t>
       </w:r>
     </w:p>
     <w:p>
@@ -5060,18 +5745,9 @@
     </w:p>
     <w:p>
       <w:pPr>
-        <w:rPr>
-          <w:b/>
-          <w:bCs/>
-          <w:u w:val="single"/>
-        </w:rPr>
+        <w:pStyle w:val="Heading1"/>
       </w:pPr>
       <w:r>
-        <w:rPr>
-          <w:b/>
-          <w:bCs/>
-          <w:u w:val="single"/>
-        </w:rPr>
         <w:t>References</w:t>
       </w:r>
     </w:p>
@@ -6167,7 +6843,6 @@
   <w:style w:type="character" w:default="1" w:styleId="DefaultParagraphFont">
     <w:name w:val="Default Paragraph Font"/>
     <w:uiPriority w:val="1"/>
-    <w:semiHidden/>
     <w:unhideWhenUsed/>
   </w:style>
   <w:style w:type="table" w:default="1" w:styleId="TableNormal">
@@ -6734,6 +7409,7 @@
     <w:rsid w:val="000701FF"/>
     <w:rsid w:val="00097F13"/>
     <w:rsid w:val="000B5A3C"/>
+    <w:rsid w:val="00216040"/>
     <w:rsid w:val="002500CE"/>
     <w:rsid w:val="0029573E"/>
     <w:rsid w:val="00475496"/>
@@ -6747,6 +7423,7 @@
     <w:rsid w:val="00C37BB3"/>
     <w:rsid w:val="00CA398C"/>
     <w:rsid w:val="00FB69FA"/>
+    <w:rsid w:val="00FE004A"/>
   </w:rsids>
   <m:mathPr>
     <m:mathFont m:val="Cambria Math"/>

</xml_diff>